<commit_message>
Fix layout in the architecture v2.1 update found by rendering it in Word
- §10.2 and §13c: the new bullets had taken the code font from the bullets they
  were cloned from; now body text with a bold lead like their neighbours.
- §13c and §14.3 code blocks: long lines wrapped mid-word; split at line
  continuations and shortened so every line fits.
- §8.2: the split-ratio table's header row was stranded at a page bottom; the
  caption, header and rows are kept together.
</commit_message>
<xml_diff>
--- a/Documentation/finetuning-architecture-v2.1.docx
+++ b/Documentation/finetuning-architecture-v2.1.docx
@@ -14180,6 +14180,7 @@
     <w:p>
       <w:pPr>
         <w:pStyle w:val="FirstParagraph"/>
+        <w:keepNext/>
       </w:pPr>
       <w:r>
         <w:rPr>
@@ -14210,12 +14211,14 @@
       <w:tr>
         <w:trPr>
           <w:tblHeader w:val="true"/>
+          <w:cantSplit/>
         </w:trPr>
         <w:tc>
           <w:tcPr/>
           <w:p>
             <w:pPr>
               <w:pStyle w:val="Compact"/>
+              <w:keepNext/>
               <w:jc w:val="left"/>
             </w:pPr>
             <w:r>
@@ -14232,6 +14235,7 @@
           <w:p>
             <w:pPr>
               <w:pStyle w:val="Compact"/>
+              <w:keepNext/>
               <w:jc w:val="left"/>
             </w:pPr>
             <w:r>
@@ -14248,6 +14252,7 @@
           <w:p>
             <w:pPr>
               <w:pStyle w:val="Compact"/>
+              <w:keepNext/>
               <w:jc w:val="left"/>
             </w:pPr>
             <w:r>
@@ -14261,11 +14266,15 @@
         </w:tc>
       </w:tr>
       <w:tr>
-        <w:tc>
-          <w:tcPr/>
-          <w:p>
-            <w:pPr>
-              <w:pStyle w:val="Compact"/>
+        <w:trPr>
+          <w:cantSplit/>
+        </w:trPr>
+        <w:tc>
+          <w:tcPr/>
+          <w:p>
+            <w:pPr>
+              <w:pStyle w:val="Compact"/>
+              <w:keepNext/>
               <w:jc w:val="left"/>
             </w:pPr>
             <w:r>
@@ -14279,6 +14288,7 @@
           <w:p>
             <w:pPr>
               <w:pStyle w:val="Compact"/>
+              <w:keepNext/>
               <w:jc w:val="left"/>
             </w:pPr>
             <w:r>
@@ -14291,6 +14301,7 @@
           <w:p>
             <w:pPr>
               <w:pStyle w:val="Compact"/>
+              <w:keepNext/>
               <w:jc w:val="left"/>
             </w:pPr>
             <w:r>
@@ -14300,11 +14311,15 @@
         </w:tc>
       </w:tr>
       <w:tr>
-        <w:tc>
-          <w:tcPr/>
-          <w:p>
-            <w:pPr>
-              <w:pStyle w:val="Compact"/>
+        <w:trPr>
+          <w:cantSplit/>
+        </w:trPr>
+        <w:tc>
+          <w:tcPr/>
+          <w:p>
+            <w:pPr>
+              <w:pStyle w:val="Compact"/>
+              <w:keepNext/>
               <w:jc w:val="left"/>
             </w:pPr>
             <w:r>
@@ -14318,6 +14333,7 @@
           <w:p>
             <w:pPr>
               <w:pStyle w:val="Compact"/>
+              <w:keepNext/>
               <w:jc w:val="left"/>
             </w:pPr>
             <w:r>
@@ -14330,6 +14346,7 @@
           <w:p>
             <w:pPr>
               <w:pStyle w:val="Compact"/>
+              <w:keepNext/>
               <w:jc w:val="left"/>
             </w:pPr>
             <w:r>
@@ -17303,15 +17320,11 @@
       </w:pPr>
       <w:r>
         <w:rPr>
-          <w:rStyle w:val="VerbatimChar"/>
           <w:b/>
         </w:rPr>
         <w:t>Pinned in pyproject.toml, one dependency group per pod:</w:t>
       </w:r>
       <w:r>
-        <w:rPr>
-          <w:rStyle w:val="VerbatimChar"/>
-        </w:rPr>
         <w:t xml:space="preserve"> ms-swift ≥ 3.9 &lt; 4, transformers ≥ 4.57, torch 2.8.x, vLLM 0.11.0 (identical on training and serving pods — calibration is fitted on its logprobs), MinerU 1.x (magic-pdf), and llmcompressor in a separate quantization environment. scripts/setup_pod.sh installs a role and builds flash-attn against the installed torch.</w:t>
       </w:r>
     </w:p>
@@ -21281,34 +21294,61 @@
         <w:rPr>
           <w:rStyle w:val="VerbatimChar"/>
         </w:rPr>
-        <w:t>python -m orchestration.run finetune --input ./intake --corpus-version v1 --out-version v2</w:t>
-      </w:r>
-      <w:r>
-        <w:br/>
-      </w:r>
-      <w:r>
-        <w:rPr>
-          <w:rStyle w:val="VerbatimChar"/>
-        </w:rPr>
-        <w:t>python -m orchestration.run package  --version v2 --release-id release-2026.11.1 --formats bf16</w:t>
-      </w:r>
-      <w:r>
-        <w:br/>
-      </w:r>
-      <w:r>
-        <w:rPr>
-          <w:rStyle w:val="VerbatimChar"/>
-        </w:rPr>
-        <w:t>python -m orchestration.run extract  --model release-2026.11.1 --input testing/test_data/</w:t>
-      </w:r>
-      <w:r>
-        <w:br/>
-      </w:r>
-      <w:r>
-        <w:rPr>
-          <w:rStyle w:val="VerbatimChar"/>
-        </w:rPr>
-        <w:t>python -m orchestration.run extract  --model base --input testing/test_data/</w:t>
+        <w:t>python -m orchestration.run finetune --input ./intake \</w:t>
+      </w:r>
+      <w:r>
+        <w:br/>
+      </w:r>
+      <w:r>
+        <w:rPr>
+          <w:rStyle w:val="VerbatimChar"/>
+        </w:rPr>
+        <w:t xml:space="preserve">    --corpus-version v1 --out-version v2</w:t>
+      </w:r>
+      <w:r>
+        <w:br/>
+      </w:r>
+      <w:r>
+        <w:rPr>
+          <w:rStyle w:val="VerbatimChar"/>
+        </w:rPr>
+        <w:t>python -m orchestration.run package --version v2 \</w:t>
+      </w:r>
+      <w:r>
+        <w:br/>
+      </w:r>
+      <w:r>
+        <w:rPr>
+          <w:rStyle w:val="VerbatimChar"/>
+        </w:rPr>
+        <w:t xml:space="preserve">    --release-id release-2026.11.1 --formats bf16</w:t>
+      </w:r>
+      <w:r>
+        <w:br/>
+      </w:r>
+      <w:r>
+        <w:rPr>
+          <w:rStyle w:val="VerbatimChar"/>
+        </w:rPr>
+        <w:t>python -m orchestration.run extract --model release-2026.11.1 \</w:t>
+      </w:r>
+      <w:r>
+        <w:br/>
+      </w:r>
+      <w:r>
+        <w:rPr>
+          <w:rStyle w:val="VerbatimChar"/>
+        </w:rPr>
+        <w:t xml:space="preserve">    --input testing/test_data/</w:t>
+      </w:r>
+      <w:r>
+        <w:br/>
+      </w:r>
+      <w:r>
+        <w:rPr>
+          <w:rStyle w:val="VerbatimChar"/>
+        </w:rPr>
+        <w:t>python -m orchestration.run extract --model base --input testing/test_data/</w:t>
       </w:r>
       <w:r>
         <w:br/>
@@ -21555,15 +21595,12 @@
       </w:pPr>
       <w:r>
         <w:rPr>
-          <w:rStyle w:val="VerbatimChar"/>
+          <w:b/>
         </w:rPr>
         <w:t>On the pod every command detaches into tmux</w:t>
       </w:r>
       <w:r>
-        <w:rPr>
-          <w:rStyle w:val="VerbatimChar"/>
-        </w:rPr>
-        <w:t xml:space="preserve"> and returns with the job’s name (bash scripts/pod_run.sh status|attach|tail|list); only the seconds-long endpoint switches run in the foreground.</w:t>
+        <w:t xml:space="preserve"> and returns with the job’s name (bash scripts/pod_run.sh status | attach | tail | list); only the seconds-long endpoint switches run in the foreground.</w:t>
       </w:r>
     </w:p>
     <w:bookmarkEnd w:id="87"/>
@@ -22042,16 +22079,16 @@
         <w:rPr>
           <w:rStyle w:val="VerbatimChar"/>
         </w:rPr>
-        <w:t xml:space="preserve">    adapters/foundation/v{n}/            unified run (checkpoint-* inside)</w:t>
-      </w:r>
-      <w:r>
-        <w:br/>
-      </w:r>
-      <w:r>
-        <w:rPr>
-          <w:rStyle w:val="VerbatimChar"/>
-        </w:rPr>
-        <w:t xml:space="preserve">    adapters/scope/{scope}/v{n}/         a scoped run</w:t>
+        <w:t xml:space="preserve">    adapters/foundation/v{n}/          unified run (checkpoint-* inside)</w:t>
+      </w:r>
+      <w:r>
+        <w:br/>
+      </w:r>
+      <w:r>
+        <w:rPr>
+          <w:rStyle w:val="VerbatimChar"/>
+        </w:rPr>
+        <w:t xml:space="preserve">    adapters/scope/{scope}/v{n}/       a scoped run</w:t>
       </w:r>
       <w:r>
         <w:br/>
@@ -22078,34 +22115,34 @@
         <w:rPr>
           <w:rStyle w:val="VerbatimChar"/>
         </w:rPr>
-        <w:t xml:space="preserve">    train-data/{scope}/v{n}/             staged ms-swift JSONL</w:t>
-      </w:r>
-      <w:r>
-        <w:br/>
-      </w:r>
-      <w:r>
-        <w:rPr>
-          <w:rStyle w:val="VerbatimChar"/>
-        </w:rPr>
-        <w:t xml:space="preserve">    train-images/{tenant}/{corpus}/      page images, one cache per corpus version</w:t>
-      </w:r>
-      <w:r>
-        <w:br/>
-      </w:r>
-      <w:r>
-        <w:rPr>
-          <w:rStyle w:val="VerbatimChar"/>
-        </w:rPr>
-        <w:t>/workspace/models/                       the pinned base model</w:t>
-      </w:r>
-      <w:r>
-        <w:br/>
-      </w:r>
-      <w:r>
-        <w:rPr>
-          <w:rStyle w:val="VerbatimChar"/>
-        </w:rPr>
-        <w:t>/workspace/logs/                         pod job logs and exit codes</w:t>
+        <w:t xml:space="preserve">    train-data/{scope}/v{n}/           staged ms-swift JSONL</w:t>
+      </w:r>
+      <w:r>
+        <w:br/>
+      </w:r>
+      <w:r>
+        <w:rPr>
+          <w:rStyle w:val="VerbatimChar"/>
+        </w:rPr>
+        <w:t xml:space="preserve">    train-images/{tenant}/{corpus}/    page-image cache per corpus</w:t>
+      </w:r>
+      <w:r>
+        <w:br/>
+      </w:r>
+      <w:r>
+        <w:rPr>
+          <w:rStyle w:val="VerbatimChar"/>
+        </w:rPr>
+        <w:t>/workspace/models/                     the pinned base model</w:t>
+      </w:r>
+      <w:r>
+        <w:br/>
+      </w:r>
+      <w:r>
+        <w:rPr>
+          <w:rStyle w:val="VerbatimChar"/>
+        </w:rPr>
+        <w:t>/workspace/logs/                       pod job logs and exit codes</w:t>
       </w:r>
     </w:p>
     <w:p>

</xml_diff>

<commit_message>
Bring the architecture docx up to date with the H200 pod, bootstrap and Blob intake
- H200 SXM 141 GB replaces the A100/L40S pod classes (§9.3, §10, §13, §14.2,
  checklist); the pod-class config path is corrected
- §14.2: CUDA 12.8 image, /workspace volume, pod_bootstrap.sh, the separate
  training and OCR environments; §10.2 likewise
- §14.4: the serving endpoint does no OCR; requests carry page texts
- §18/§19: intake/ staging in the raw container, pull_intake, pod_bootstrap.sh
- Revision v2.2 table: data audit, H200 pod, two environments, bootstrap,
  pinned base revision, Blob intake
- README: serving-time OCR placement listed as open; SPEC_10 FP8 list names H200
</commit_message>
<xml_diff>
--- a/Documentation/finetuning-architecture-v2.1.docx
+++ b/Documentation/finetuning-architecture-v2.1.docx
@@ -28,7 +28,7 @@
       </w:pPr>
       <w:r>
         <w:rPr/>
-        <w:t>Insurance Document Extraction (ACORD, Policy, Loss Run) — v2.1, with the v2.2 implementation update (2026-09-27)</w:t>
+        <w:t>Insurance Document Extraction (ACORD, Policy, Loss Run) — v2.1, with the v2.2 implementation update (2026-09-29)</w:t>
       </w:r>
     </w:p>
     <w:p>
@@ -360,7 +360,7 @@
       </w:pPr>
       <w:r>
         <w:rPr/>
-        <w:t>What the implementation settled after v2.1, as of 2026-09-27. Sections that stated otherwise are corrected in place; the implementation specs (Documentation/Implementation MDs, SPEC_00 §13 and each spec's “Current implementation” section) carry the module-level detail.</w:t>
+        <w:t>What the implementation settled after v2.1, as of 2026-09-29. Sections that stated otherwise are corrected in place; the implementation specs (Documentation/Implementation MDs, SPEC_00 §13 and each spec's “Current implementation” section) carry the module-level detail.</w:t>
       </w:r>
     </w:p>
     <w:tbl>
@@ -1203,6 +1203,252 @@
             <w:r>
               <w:rPr/>
               <w:t>The enum rejected flood, cyber and the schema spellings, failing the corpus build</w:t>
+            </w:r>
+          </w:p>
+        </w:tc>
+      </w:tr>
+      <w:tr>
+        <w:tc>
+          <w:tcPr/>
+          <w:p>
+            <w:pPr>
+              <w:pStyle w:val="Compact"/>
+              <w:jc w:val="left"/>
+            </w:pPr>
+            <w:r>
+              <w:rPr/>
+              <w:t>Data is audited before upload (python -m data_pipeline.audit): layout, labels against the PDF text, formats, totals, a spot-check sample; blockers must be zero. The gate may use an eval set frozen from its own corpus build</w:t>
+            </w:r>
+          </w:p>
+        </w:tc>
+        <w:tc>
+          <w:tcPr/>
+          <w:p>
+            <w:pPr>
+              <w:pStyle w:val="Compact"/>
+              <w:jc w:val="left"/>
+            </w:pPr>
+            <w:r>
+              <w:rPr/>
+              <w:t>§8, §15.4</w:t>
+            </w:r>
+          </w:p>
+        </w:tc>
+        <w:tc>
+          <w:tcPr/>
+          <w:p>
+            <w:pPr>
+              <w:pStyle w:val="Compact"/>
+              <w:jc w:val="left"/>
+            </w:pPr>
+            <w:r>
+              <w:rPr/>
+              <w:t>Label errors found after training cost a retrain; the first corpus build had no earlier set to freeze</w:t>
+            </w:r>
+          </w:p>
+        </w:tc>
+      </w:tr>
+      <w:tr>
+        <w:tc>
+          <w:tcPr/>
+          <w:p>
+            <w:pPr>
+              <w:pStyle w:val="Compact"/>
+              <w:jc w:val="left"/>
+            </w:pPr>
+            <w:r>
+              <w:rPr/>
+              <w:t>One H200 SXM (141 GB) pod runs every GPU stage in process, on a CUDA 12.8 / torch 2.8 image, with a network volume at /workspace for environments, base model, staging and logs</w:t>
+            </w:r>
+          </w:p>
+        </w:tc>
+        <w:tc>
+          <w:tcPr/>
+          <w:p>
+            <w:pPr>
+              <w:pStyle w:val="Compact"/>
+              <w:jc w:val="left"/>
+            </w:pPr>
+            <w:r>
+              <w:rPr/>
+              <w:t>§13, §14.2</w:t>
+            </w:r>
+          </w:p>
+        </w:tc>
+        <w:tc>
+          <w:tcPr/>
+          <w:p>
+            <w:pPr>
+              <w:pStyle w:val="Compact"/>
+              <w:jc w:val="left"/>
+            </w:pPr>
+            <w:r>
+              <w:rPr/>
+              <w:t>The stack pins torch 2.8 / vLLM 0.11, which the CUDA 12.4 / torch 2.4 image could not run; the container disk is wiped on stop</w:t>
+            </w:r>
+          </w:p>
+        </w:tc>
+      </w:tr>
+      <w:tr>
+        <w:tc>
+          <w:tcPr/>
+          <w:p>
+            <w:pPr>
+              <w:pStyle w:val="Compact"/>
+              <w:jc w:val="left"/>
+            </w:pPr>
+            <w:r>
+              <w:rPr/>
+              <w:t>Two environments: /workspace/venv (training + serving) and /workspace/venv-ocr (MinerU 1.x). OCR runs first, in its own; finetune refuses with that command while documents still need OCR. The serving endpoint does no OCR</w:t>
+            </w:r>
+          </w:p>
+        </w:tc>
+        <w:tc>
+          <w:tcPr/>
+          <w:p>
+            <w:pPr>
+              <w:pStyle w:val="Compact"/>
+              <w:jc w:val="left"/>
+            </w:pPr>
+            <w:r>
+              <w:rPr/>
+              <w:t>§8a, §10.2, §14.2, §14.4</w:t>
+            </w:r>
+          </w:p>
+        </w:tc>
+        <w:tc>
+          <w:tcPr/>
+          <w:p>
+            <w:pPr>
+              <w:pStyle w:val="Compact"/>
+              <w:jc w:val="left"/>
+            </w:pPr>
+            <w:r>
+              <w:rPr/>
+              <w:t>MinerU 1.x cannot be installed alongside vLLM 0.11 / torch 2.8</w:t>
+            </w:r>
+          </w:p>
+        </w:tc>
+      </w:tr>
+      <w:tr>
+        <w:tc>
+          <w:tcPr/>
+          <w:p>
+            <w:pPr>
+              <w:pStyle w:val="Compact"/>
+              <w:jc w:val="left"/>
+            </w:pPr>
+            <w:r>
+              <w:rPr/>
+              <w:t>One-command pod bootstrap (scripts/pod_bootstrap.sh): checks, .env keys, both environments, MinerU’s config on the volume set to cuda, the base model at its pinned revision, the Phase 0 spike</w:t>
+            </w:r>
+          </w:p>
+        </w:tc>
+        <w:tc>
+          <w:tcPr/>
+          <w:p>
+            <w:pPr>
+              <w:pStyle w:val="Compact"/>
+              <w:jc w:val="left"/>
+            </w:pPr>
+            <w:r>
+              <w:rPr/>
+              <w:t>§14.2</w:t>
+            </w:r>
+          </w:p>
+        </w:tc>
+        <w:tc>
+          <w:tcPr/>
+          <w:p>
+            <w:pPr>
+              <w:pStyle w:val="Compact"/>
+              <w:jc w:val="left"/>
+            </w:pPr>
+            <w:r>
+              <w:rPr/>
+              <w:t>A fresh pod needed a dozen manual steps, each easy to get wrong</w:t>
+            </w:r>
+          </w:p>
+        </w:tc>
+      </w:tr>
+      <w:tr>
+        <w:tc>
+          <w:tcPr/>
+          <w:p>
+            <w:pPr>
+              <w:pStyle w:val="Compact"/>
+              <w:jc w:val="left"/>
+            </w:pPr>
+            <w:r>
+              <w:rPr/>
+              <w:t>Base model pinned: Qwen/Qwen3-VL-8B-Instruct@0c351dd01ed87e9c1b53cbc748cba10e6187ff3b (Hub commit of 2025-10-15)</w:t>
+            </w:r>
+          </w:p>
+        </w:tc>
+        <w:tc>
+          <w:tcPr/>
+          <w:p>
+            <w:pPr>
+              <w:pStyle w:val="Compact"/>
+              <w:jc w:val="left"/>
+            </w:pPr>
+            <w:r>
+              <w:rPr/>
+              <w:t>§9, §12</w:t>
+            </w:r>
+          </w:p>
+        </w:tc>
+        <w:tc>
+          <w:tcPr/>
+          <w:p>
+            <w:pPr>
+              <w:pStyle w:val="Compact"/>
+              <w:jc w:val="left"/>
+            </w:pPr>
+            <w:r>
+              <w:rPr/>
+              <w:t>A floating revision makes a regression unattributable</w:t>
+            </w:r>
+          </w:p>
+        </w:tc>
+      </w:tr>
+      <w:tr>
+        <w:tc>
+          <w:tcPr/>
+          <w:p>
+            <w:pPr>
+              <w:pStyle w:val="Compact"/>
+              <w:jc w:val="left"/>
+            </w:pPr>
+            <w:r>
+              <w:rPr/>
+              <w:t>Delivered batches travel through Blob: staged with azcopy under intake/{batch}/ in the raw container, pulled onto the pod (pull_intake, or import_labeled_pdfs --from-blob) and imported there</w:t>
+            </w:r>
+          </w:p>
+        </w:tc>
+        <w:tc>
+          <w:tcPr/>
+          <w:p>
+            <w:pPr>
+              <w:pStyle w:val="Compact"/>
+              <w:jc w:val="left"/>
+            </w:pPr>
+            <w:r>
+              <w:rPr/>
+              <w:t>§8, §18</w:t>
+            </w:r>
+          </w:p>
+        </w:tc>
+        <w:tc>
+          <w:tcPr/>
+          <w:p>
+            <w:pPr>
+              <w:pStyle w:val="Compact"/>
+              <w:jc w:val="left"/>
+            </w:pPr>
+            <w:r>
+              <w:rPr/>
+              <w:t>The ~20 GB training folder cannot go through git; staged documents carry the same PII as raw-documents/</w:t>
             </w:r>
           </w:p>
         </w:tc>
@@ -15953,7 +16199,7 @@
         <w:t xml:space="preserve"> </w:t>
       </w:r>
       <w:r>
-        <w:t xml:space="preserve">(§7a), on an A100 80 GB, and writes it to the spike report. The pod class table in §14 is filled from that report. If the 32,768 cap does not fit on one 80 GB GPU with gradient checkpointing,</w:t>
+        <w:t>(§7a), on the H200 SXM 141 GB, and writes it to the spike report. The pod class table in §14 is filled from that report. If the 32,768 cap does not fit on one GPU with gradient checkpointing,</w:t>
       </w:r>
       <w:r>
         <w:t xml:space="preserve"> </w:t>
@@ -17356,7 +17602,7 @@
         <w:t xml:space="preserve"> </w:t>
       </w:r>
       <w:r>
-        <w:t xml:space="preserve">single A100 80 GB by default. Sequence parallelism if a task cap does not fit (§9.3). DeepSpeed ZeRO is not used unless both of those are exhausted.</w:t>
+        <w:t>single H200 SXM 141 GB by default. Sequence parallelism if a task cap does not fit (§9.3). DeepSpeed ZeRO is not used unless both of those are exhausted.</w:t>
       </w:r>
     </w:p>
     <w:p>
@@ -17530,7 +17776,7 @@
         <w:t>Pinned in pyproject.toml, one dependency group per pod:</w:t>
       </w:r>
       <w:r>
-        <w:t xml:space="preserve"> ms-swift ≥ 3.9 &lt; 4, transformers ≥ 4.57, torch 2.8.x, vLLM 0.11.0 (identical on training and serving pods — calibration is fitted on its logprobs), MinerU 1.x (magic-pdf), and llmcompressor in a separate quantization environment. scripts/setup_pod.sh installs a role and builds flash-attn against the installed torch.</w:t>
+        <w:t xml:space="preserve"> ms-swift ≥ 3.9 &lt; 4, transformers ≥ 4.57, torch 2.8.x, vLLM 0.11.0 (identical on training and serving pods — calibration is fitted on its logprobs), MinerU 1.x (magic-pdf) in its own OCR environment, and llmcompressor in a separate quantization environment. scripts/setup_pod.sh installs a role and builds flash-attn against the installed torch; scripts/pod_bootstrap.sh builds the training and OCR environments on the volume.</w:t>
       </w:r>
     </w:p>
     <w:p>
@@ -20509,7 +20755,7 @@
               <w:jc w:val="left"/>
             </w:pPr>
             <w:r>
-              <w:t xml:space="preserve">Native FP8 on Ada / Hopper (L4, L40S, H100); weight-only path on A100</w:t>
+              <w:t>Native FP8 on Ada / Hopper (L4, L40S, H100, H200); weight-only path on A100</w:t>
             </w:r>
           </w:p>
         </w:tc>
@@ -21636,7 +21882,7 @@
           <w:bCs/>
           <w:b/>
         </w:rPr>
-        <w:t xml:space="preserve"> </w:t>
+        <w:t xml:space="preserve"> orchestration/</w:t>
       </w:r>
       <w:r>
         <w:rPr>
@@ -21644,25 +21890,20 @@
           <w:bCs/>
           <w:b/>
         </w:rPr>
-        <w:t xml:space="preserve">configs/pipeline/stages.yaml</w:t>
-      </w:r>
-      <w:r>
-        <w:t xml:space="preserve">, not CLI flags, so reruns are reproducible. At pilot scale</w:t>
-      </w:r>
-      <w:r>
-        <w:t xml:space="preserve"> </w:t>
-      </w:r>
-      <w:r>
-        <w:rPr>
-          <w:rStyle w:val="VerbatimChar"/>
-        </w:rPr>
-        <w:t xml:space="preserve">finetune</w:t>
-      </w:r>
-      <w:r>
-        <w:t xml:space="preserve"> </w:t>
-      </w:r>
-      <w:r>
-        <w:t xml:space="preserve">runs OCR and training on one pod; at scale, stage 2 runs on an L4/L40S OCR pod and stages 5–7 on the A100 pod.</w:t>
+        <w:t>config/pipeline.yaml</w:t>
+      </w:r>
+      <w:r>
+        <w:t>, not CLI flags, so reruns are reproducible. Every GPU</w:t>
+      </w:r>
+      <w:r/>
+      <w:r>
+        <w:rPr>
+          <w:rStyle w:val="VerbatimChar"/>
+        </w:rPr>
+      </w:r>
+      <w:r/>
+      <w:r>
+        <w:t xml:space="preserve"> stage runs on one H200 SXM (141 GB) pod, in process, each vLLM engine released before the next loads; the per-stage classes stay configurable should OCR later move to a cheaper L4/L40S pod.</w:t>
       </w:r>
     </w:p>
     <w:p>
@@ -21796,7 +22037,7 @@
         <w:rPr>
           <w:rStyle w:val="VerbatimChar"/>
         </w:rPr>
-        <w:t xml:space="preserve">clone repo @ commit                         vLLM + MinerU (same GPU worker)</w:t>
+        <w:t>clone repo @ commit                         vLLM worker (OCR runs upstream)</w:t>
       </w:r>
       <w:r>
         <w:br/>
@@ -22106,7 +22347,7 @@
               <w:jc w:val="left"/>
             </w:pPr>
             <w:r>
-              <w:t xml:space="preserve">L4 or L40S</w:t>
+              <w:t>H200 SXM 141 GB (the one pod)</w:t>
             </w:r>
           </w:p>
         </w:tc>
@@ -22132,7 +22373,7 @@
               <w:jc w:val="left"/>
             </w:pPr>
             <w:r>
-              <w:t xml:space="preserve">A100 80 GB (×2 only if sequence parallelism is required, §9.3)</w:t>
+              <w:t>H200 SXM 141 GB (×2 only if sequence parallelism is required, §9.3)</w:t>
             </w:r>
           </w:p>
         </w:tc>
@@ -22158,7 +22399,7 @@
               <w:jc w:val="left"/>
             </w:pPr>
             <w:r>
-              <w:t xml:space="preserve">L40S 48 GB</w:t>
+              <w:t>H200 SXM 141 GB</w:t>
             </w:r>
           </w:p>
         </w:tc>
@@ -22184,7 +22425,7 @@
               <w:jc w:val="left"/>
             </w:pPr>
             <w:r>
-              <w:t xml:space="preserve">L40S 48 GB</w:t>
+              <w:t>H200 SXM 141 GB</w:t>
             </w:r>
           </w:p>
         </w:tc>
@@ -22196,7 +22437,7 @@
       </w:pPr>
       <w:r>
         <w:rPr/>
-        <w:t>Final pod classes are confirmed from the Phase-0 memory report. Training code lives in git; pods clone at a pinned commit and terminate on completion. The base model is read from the pod’s local copy under /workspace/models. Every step that runs a model — training, merge, quantization, vLLM, MinerU — refuses to start without CUDA rather than fall back to the CPU. Every long job runs detached in tmux, so it survives the operator’s laptop shutting down or losing its connection.</w:t>
+        <w:t>Final pod classes are confirmed from the Phase-0 memory report. The pod runs runpod/pytorch:2.8.0-py3.11-cuda12.8.1 with a network volume at /workspace, because the container disk is wiped when the pod stops. scripts/pod_bootstrap.sh prepares it in one command: GPU, mount and free-space checks; the .env keys; two environments on the volume (/workspace/venv for training and serving, /workspace/venv-ocr for MinerU 1.x, which cannot share an environment with vLLM 0.11 / torch 2.8); MinerU’s config on the volume set to cuda; the base model at its pinned revision; the Phase 0 spike. OCR runs first, in its own environment; finetune then finds nothing left to OCR. Training code lives in git; pods clone at a pinned commit and terminate on completion. The base model is read from the pod’s local copy under /workspace/models. Every step that runs a model — training, merge, quantization, vLLM, MinerU — refuses to start without CUDA rather than fall back to the CPU. Every long job runs detached in tmux, so it survives the operator’s laptop shutting down or losing its connection.</w:t>
       </w:r>
     </w:p>
     <w:bookmarkEnd w:id="90"/>
@@ -22393,7 +22634,7 @@
         <w:t xml:space="preserve"> </w:t>
       </w:r>
       <w:r>
-        <w:t xml:space="preserve">worker image: vLLM (pinned) + MinerU (pinned) + the serving handler.</w:t>
+        <w:t>worker image: vLLM (pinned) + the serving handler. The endpoint does no OCR: requests carry page texts produced by MinerU at the corpus pin, in its own environment (it cannot share one with vLLM 0.11). Where serving-time OCR runs on a GPU is open.</w:t>
       </w:r>
     </w:p>
     <w:p>
@@ -25120,7 +25361,7 @@
               <w:jc w:val="left"/>
             </w:pPr>
             <w:r>
-              <w:t xml:space="preserve">Peak VRAM per task cap on A100 80 GB with</w:t>
+              <w:t>Peak VRAM per task cap on the H200 SXM 141 GB with</w:t>
             </w:r>
             <w:r>
               <w:t xml:space="preserve"> </w:t>
@@ -27113,6 +27354,15 @@
         <w:br/>
       </w:r>
       <w:r>
+        <w:rPr>
+          <w:rStyle w:val="VerbatimChar"/>
+        </w:rPr>
+        <w:t xml:space="preserve">  intake/{batch}/{document}/                      # delivered batches: PDF + golden.json + metadata.json, staged by azcopy</w:t>
+      </w:r>
+      <w:r>
+        <w:br/>
+      </w:r>
+      <w:r>
         <w:br/>
       </w:r>
       <w:r>
@@ -27993,7 +28243,7 @@
         <w:rPr>
           <w:rStyle w:val="VerbatimChar"/>
         </w:rPr>
-        <w:t>│   ├── ingestion/    pull_raw_pdfs  import_labeled_pdfs</w:t>
+        <w:t>│   ├── ingestion/    pull_raw_pdfs  import_labeled_pdfs  pull_intake</w:t>
       </w:r>
       <w:r>
         <w:br/>
@@ -28245,7 +28495,7 @@
         <w:rPr>
           <w:rStyle w:val="VerbatimChar"/>
         </w:rPr>
-        <w:t>├── scripts/          setup_pod.sh  pod_run.sh  phase0_spike.py</w:t>
+        <w:t>├── scripts/          pod_bootstrap.sh  setup_pod.sh  pod_run.sh  phase0_spike.py</w:t>
       </w:r>
       <w:r>
         <w:br/>
@@ -28729,7 +28979,7 @@
         <w:t xml:space="preserve">use_logits_to_keep</w:t>
       </w:r>
       <w:r>
-        <w:t xml:space="preserve">, padding-free, gradient checkpointing; single A100 80 GB; sequence parallel before ZeRO-3</w:t>
+        <w:t>, padding-free, gradient checkpointing; single H200 SXM 141 GB; sequence parallel before ZeRO-3</w:t>
       </w:r>
     </w:p>
     <w:p>

</xml_diff>